<commit_message>
Improve memory retrieval intent handling
</commit_message>
<xml_diff>
--- a/docs/main分支验收指南-Workbench与DirectSkill.docx
+++ b/docs/main分支验收指南-Workbench与DirectSkill.docx
@@ -956,94 +956,18 @@
         <w:spacing w:before="60" w:after="120"/>
       </w:pPr>
       <w:r>
-        <w:rPr>
-          <w:rFonts w:ascii="Menlo" w:hAnsi="Menlo" w:eastAsia="Menlo"/>
-          <w:sz w:val="18"/>
-        </w:rPr>
         <w:t>$assist-everything-betterandbetter-skill 帮我给女朋友选个生日礼物</w:t>
-      </w:r>
-      <w:r>
-        <w:rPr>
-          <w:rFonts w:ascii="Menlo" w:hAnsi="Menlo" w:eastAsia="Menlo"/>
-          <w:sz w:val="18"/>
-        </w:rPr>
-        <w:br w:type="textWrapping"/>
-      </w:r>
-      <w:r>
-        <w:rPr>
-          <w:rFonts w:ascii="Menlo" w:hAnsi="Menlo" w:eastAsia="Menlo"/>
-          <w:sz w:val="18"/>
-        </w:rPr>
+        <w:br/>
         <w:t>预算1000元左右；她喜欢紫色；如果是首饰，她喜欢玫瑰金；以前送过玫瑰金项链，送过的不要再送。</w:t>
-      </w:r>
-      <w:r>
-        <w:rPr>
-          <w:rFonts w:ascii="Menlo" w:hAnsi="Menlo" w:eastAsia="Menlo"/>
-          <w:sz w:val="18"/>
-        </w:rPr>
-        <w:br w:type="textWrapping"/>
-      </w:r>
-      <w:r>
-        <w:rPr>
-          <w:rFonts w:ascii="Menlo" w:hAnsi="Menlo" w:eastAsia="Menlo"/>
-          <w:sz w:val="18"/>
-        </w:rPr>
+        <w:br/>
         <w:t>喜欢玫瑰金色的首饰，不用硬凹紫色</w:t>
-      </w:r>
-      <w:r>
-        <w:rPr>
-          <w:rFonts w:ascii="Menlo" w:hAnsi="Menlo" w:eastAsia="Menlo"/>
-          <w:sz w:val="18"/>
-        </w:rPr>
-        <w:br w:type="textWrapping"/>
-      </w:r>
-      <w:r>
-        <w:rPr>
-          <w:rFonts w:ascii="Menlo" w:hAnsi="Menlo" w:eastAsia="Menlo"/>
-          <w:sz w:val="18"/>
-        </w:rPr>
+        <w:br/>
         <w:t>选玫瑰金耳钉</w:t>
-      </w:r>
-      <w:r>
-        <w:rPr>
-          <w:rFonts w:ascii="Menlo" w:hAnsi="Menlo" w:eastAsia="Menlo"/>
-          <w:sz w:val="18"/>
-        </w:rPr>
-        <w:br w:type="textWrapping"/>
-      </w:r>
-      <w:r>
-        <w:rPr>
-          <w:rFonts w:ascii="Menlo" w:hAnsi="Menlo" w:eastAsia="Menlo"/>
-          <w:sz w:val="18"/>
-        </w:rPr>
+        <w:br/>
         <w:t>展示当前记忆</w:t>
-      </w:r>
-      <w:r>
-        <w:rPr>
-          <w:rFonts w:ascii="Menlo" w:hAnsi="Menlo" w:eastAsia="Menlo"/>
-          <w:sz w:val="18"/>
-        </w:rPr>
-        <w:br w:type="textWrapping"/>
-      </w:r>
-      <w:r>
-        <w:rPr>
-          <w:rFonts w:ascii="Menlo" w:hAnsi="Menlo" w:eastAsia="Menlo"/>
-          <w:sz w:val="18"/>
-        </w:rPr>
-        <w:t>重置当前 session，但不要清空长期记忆</w:t>
-      </w:r>
-      <w:r>
-        <w:rPr>
-          <w:rFonts w:ascii="Menlo" w:hAnsi="Menlo" w:eastAsia="Menlo"/>
-          <w:sz w:val="18"/>
-        </w:rPr>
-        <w:br w:type="textWrapping"/>
-      </w:r>
-      <w:r>
-        <w:rPr>
-          <w:rFonts w:ascii="Menlo" w:hAnsi="Menlo" w:eastAsia="Menlo"/>
-          <w:sz w:val="18"/>
-        </w:rPr>
+        <w:br/>
+        <w:t>重置当前 session，但不要清空长期记忆。等待 Agent 确认已重置后，再发送下一句：</w:t>
+        <w:br/>
         <w:t>再帮我给女朋友选一个生日礼物</w:t>
       </w:r>
     </w:p>

</xml_diff>